<commit_message>
Assignment 5: fix grammar in AI/verification note and duplicate label in agent_record.md
Word: "It assisted with drafting ..., constructing ..., and generating ..."
(three words changed). Markdown: removed repeated "AI / verification note:".

Co-Authored-By: Claude Opus 5.5 <noreply@anthropic.com>
Claude-Session: https://claude.ai/code/session_01LZJHSj7hT9sCLBjpyJ1114
</commit_message>
<xml_diff>
--- a/agents/diffusion_agent/submission/Assignment_5_Agent_Record_Minghan_Liu.docx
+++ b/agents/diffusion_agent/submission/Assignment_5_Agent_Record_Minghan_Liu.docx
@@ -2932,7 +2932,7 @@
                 <w:szCs w:val="22"/>
                 <w:lang w:eastAsia="en-US"/>
               </w:rPr>
-              <w:t>I used Claude (Anthropic) as a development assistant. assisted with drafting and revising</w:t>
+              <w:t>I used Claude (Anthropic) as a development assistant. It assisted with drafting and revising</w:t>
             </w:r>
             <w:r>
               <w:rPr>
@@ -2949,7 +2949,7 @@
                 <w:szCs w:val="22"/>
                 <w:lang w:eastAsia="en-US"/>
               </w:rPr>
-              <w:t>the specialist instructions, construct the four test cases, and generate initial responses to the frozen prompt packets for both cycles. The frozen scripts handled packet building and validation. I reviewed all outputs, checked key figures against the original sources, and made the final decisions on staging, timing recommendations, and the revisions between cycle 1 and cycle 2. Course concepts were verified against the Module 6 slides. Model memory and AI summaries were not treated as evidence. One limitation is that generation and review occurred in the same session without a blinded external check. I personally checked the Census BTOS 19.8% figure, the Ellucian 36% chatbot figure, and the difference between the cycle 1 and cycle 2 outputs.</w:t>
+              <w:t>the specialist instructions, constructing the four test cases, and generating initial responses to the frozen prompt packets for both cycles. The frozen scripts handled packet building and validation. I reviewed all outputs, checked key figures against the original sources, and made the final decisions on staging, timing recommendations, and the revisions between cycle 1 and cycle 2. Course concepts were verified against the Module 6 slides. Model memory and AI summaries were not treated as evidence. One limitation is that generation and review occurred in the same session without a blinded external check. I personally checked the Census BTOS 19.8% figure, the Ellucian 36% chatbot figure, and the difference between the cycle 1 and cycle 2 outputs.</w:t>
             </w:r>
           </w:p>
         </w:tc>

</xml_diff>